<commit_message>
Update video conference More-menu screenshot and steps
Replace the figure with the latest console screenshot and clarify
idle black-screen behavior plus bandwidth/frame/lock controls.

Co-authored-by: zhangningde <zhangningde@users.noreply.github.com>
</commit_message>
<xml_diff>
--- a/output/5G+IMS_AI智能远程协助系统操作员使用手册_20261023_V3.0.docx
+++ b/output/5G+IMS_AI智能远程协助系统操作员使用手册_20261023_V3.0.docx
@@ -1259,7 +1259,7 @@
           <w:b w:val="0"/>
           <w:sz w:val="22"/>
         </w:rPr>
-        <w:t>操作说明：会议底部工具栏提供邀请、布局、成员、禁言、更多和结束等功能。【更多】菜单中可进行带宽、帧率、位置、主屏、比例及会议锁定等设置。结束会议前请确认业务已办理完毕。</w:t>
+        <w:t>操作说明：会议底部工具栏提供【邀请】【布局】【成员】【禁言】【更多】【结束】等功能。未建立会议时，视频窗口显示为黑屏且时长为0:00，部分会中按钮可能呈灰色，属于正常状态。单击【更多】后，弹出带宽、帧率、位置、主屏、比例和锁定等扩展控制；结束会议前请确认业务已办理完毕。</w:t>
       </w:r>
     </w:p>
     <w:p>
@@ -1270,7 +1270,7 @@
       <w:r>
         <w:drawing>
           <wp:inline xmlns:a="http://schemas.openxmlformats.org/drawingml/2006/main" xmlns:pic="http://schemas.openxmlformats.org/drawingml/2006/picture">
-            <wp:extent cx="5472000" cy="3078000"/>
+            <wp:extent cx="5472000" cy="3074670"/>
             <wp:docPr id="5" name="Picture 5"/>
             <wp:cNvGraphicFramePr>
               <a:graphicFrameLocks noChangeAspect="1"/>
@@ -1291,7 +1291,7 @@
                   <pic:spPr>
                     <a:xfrm>
                       <a:off x="0" y="0"/>
-                      <a:ext cx="5472000" cy="3078000"/>
+                      <a:ext cx="5472000" cy="3074670"/>
                     </a:xfrm>
                     <a:prstGeom prst="rect"/>
                   </pic:spPr>
@@ -1314,7 +1314,7 @@
           <w:color w:val="666666"/>
           <w:sz w:val="18"/>
         </w:rPr>
-        <w:t>图 3.2.4  会议操作</w:t>
+        <w:t>图 3.2.4  会议操作（单击【更多】后的扩展菜单）</w:t>
       </w:r>
     </w:p>
     <w:p>
@@ -1459,7 +1459,7 @@
           <w:b w:val="0"/>
           <w:sz w:val="22"/>
         </w:rPr>
-        <w:t>操作说明：根据网络条件和会议质量要求选择合适的会议带宽。网络不稳定时可适当降低带宽，以提高会议连续性。</w:t>
+        <w:t>操作说明：在【更多】菜单中选择【带宽】，根据网络条件和会议质量要求设置会议带宽。网络不稳定时可适当降低带宽，以提高会议连续性。</w:t>
       </w:r>
     </w:p>
     <w:p>
@@ -1488,7 +1488,7 @@
           <w:b w:val="0"/>
           <w:sz w:val="22"/>
         </w:rPr>
-        <w:t>操作说明：设置视频帧率。较高帧率画面更流畅，但会占用更多网络资源；应结合终端能力和网络状况选择。</w:t>
+        <w:t>操作说明：在【更多】菜单中选择【帧率】设置视频帧率。较高帧率画面更流畅，但会占用更多网络资源；应结合终端能力和网络状况选择。</w:t>
       </w:r>
     </w:p>
     <w:p>
@@ -1517,7 +1517,7 @@
           <w:b w:val="0"/>
           <w:sz w:val="22"/>
         </w:rPr>
-        <w:t>操作说明：调整选定成员在会议画面布局中的显示位置，确认后观察布局是否符合会商需要。</w:t>
+        <w:t>操作说明：在【更多】菜单中选择【位置】，调整选定成员在会议画面布局中的显示位置，确认后观察布局是否符合会商需要。</w:t>
       </w:r>
     </w:p>
     <w:p>
@@ -1546,7 +1546,7 @@
           <w:b w:val="0"/>
           <w:sz w:val="22"/>
         </w:rPr>
-        <w:t>操作说明：选择目标成员并将其指定为主屏，使该成员画面在主显示区域呈现。</w:t>
+        <w:t>操作说明：在【更多】菜单中选择【主屏】，将目标成员指定为主屏，使该成员画面在主显示区域呈现。</w:t>
       </w:r>
     </w:p>
     <w:p>
@@ -1575,7 +1575,7 @@
           <w:b w:val="0"/>
           <w:sz w:val="22"/>
         </w:rPr>
-        <w:t>操作说明：根据显示设备和画面内容选择适合的显示比例，避免画面拉伸、裁切或出现过多留白。</w:t>
+        <w:t>操作说明：在【更多】菜单中选择【比例】，根据显示设备和画面内容选择适合的显示比例，避免画面拉伸、裁切或出现过多留白。</w:t>
       </w:r>
     </w:p>
     <w:p>
@@ -1604,7 +1604,7 @@
           <w:b w:val="0"/>
           <w:sz w:val="22"/>
         </w:rPr>
-        <w:t>操作说明：锁定会议后可限制未获授权的成员加入；需要继续邀请成员时先解锁。操作后应核对会议锁定状态。</w:t>
+        <w:t>操作说明：在【更多】菜单中选择【锁定】可限制未获授权的成员加入；需要继续邀请成员时先解锁。操作后应核对会议锁定状态。</w:t>
       </w:r>
     </w:p>
     <w:p>

</xml_diff>